<commit_message>
added space ship and coin system
</commit_message>
<xml_diff>
--- a/Spaceship float/Credits.docx
+++ b/Spaceship float/Credits.docx
@@ -1,6 +1,6 @@
 
 <file path=word/document.xml><?xml version="1.0" encoding="utf-8"?>
-<w:document xmlns:wpc="http://schemas.microsoft.com/office/word/2010/wordprocessingCanvas" xmlns:cx="http://schemas.microsoft.com/office/drawing/2014/chartex" xmlns:cx1="http://schemas.microsoft.com/office/drawing/2015/9/8/chartex" xmlns:cx2="http://schemas.microsoft.com/office/drawing/2015/10/21/chartex" xmlns:cx3="http://schemas.microsoft.com/office/drawing/2016/5/9/chartex" xmlns:cx4="http://schemas.microsoft.com/office/drawing/2016/5/10/chartex" xmlns:cx5="http://schemas.microsoft.com/office/drawing/2016/5/11/chartex" xmlns:cx6="http://schemas.microsoft.com/office/drawing/2016/5/12/chartex" xmlns:cx7="http://schemas.microsoft.com/office/drawing/2016/5/13/chartex" xmlns:cx8="http://schemas.microsoft.com/office/drawing/2016/5/14/chartex" xmlns:mc="http://schemas.openxmlformats.org/markup-compatibility/2006" xmlns:aink="http://schemas.microsoft.com/office/drawing/2016/ink" xmlns:am3d="http://schemas.microsoft.com/office/drawing/2017/model3d" xmlns:o="urn:schemas-microsoft-com:office:office" xmlns:r="http://schemas.openxmlformats.org/officeDocument/2006/relationships" xmlns:m="http://schemas.openxmlformats.org/officeDocument/2006/math" xmlns:v="urn:schemas-microsoft-com:vml" xmlns:wp14="http://schemas.microsoft.com/office/word/2010/wordprocessingDrawing" xmlns:wp="http://schemas.openxmlformats.org/drawingml/2006/wordprocessingDrawing" xmlns:w10="urn:schemas-microsoft-com:office:word" xmlns:w="http://schemas.openxmlformats.org/wordprocessingml/2006/main" xmlns:w14="http://schemas.microsoft.com/office/word/2010/wordml" xmlns:w15="http://schemas.microsoft.com/office/word/2012/wordml" xmlns:w16cid="http://schemas.microsoft.com/office/word/2016/wordml/cid" xmlns:w16se="http://schemas.microsoft.com/office/word/2015/wordml/symex" xmlns:wpg="http://schemas.microsoft.com/office/word/2010/wordprocessingGroup" xmlns:wpi="http://schemas.microsoft.com/office/word/2010/wordprocessingInk" xmlns:wne="http://schemas.microsoft.com/office/word/2006/wordml" xmlns:wps="http://schemas.microsoft.com/office/word/2010/wordprocessingShape" mc:Ignorable="w14 w15 w16se w16cid wp14">
+<w:document xmlns:wpc="http://schemas.microsoft.com/office/word/2010/wordprocessingCanvas" xmlns:cx="http://schemas.microsoft.com/office/drawing/2014/chartex" xmlns:cx1="http://schemas.microsoft.com/office/drawing/2015/9/8/chartex" xmlns:cx2="http://schemas.microsoft.com/office/drawing/2015/10/21/chartex" xmlns:cx3="http://schemas.microsoft.com/office/drawing/2016/5/9/chartex" xmlns:cx4="http://schemas.microsoft.com/office/drawing/2016/5/10/chartex" xmlns:cx5="http://schemas.microsoft.com/office/drawing/2016/5/11/chartex" xmlns:cx6="http://schemas.microsoft.com/office/drawing/2016/5/12/chartex" xmlns:cx7="http://schemas.microsoft.com/office/drawing/2016/5/13/chartex" xmlns:cx8="http://schemas.microsoft.com/office/drawing/2016/5/14/chartex" xmlns:mc="http://schemas.openxmlformats.org/markup-compatibility/2006" xmlns:aink="http://schemas.microsoft.com/office/drawing/2016/ink" xmlns:am3d="http://schemas.microsoft.com/office/drawing/2017/model3d" xmlns:o="urn:schemas-microsoft-com:office:office" xmlns:oel="http://schemas.microsoft.com/office/2019/extlst" xmlns:r="http://schemas.openxmlformats.org/officeDocument/2006/relationships" xmlns:m="http://schemas.openxmlformats.org/officeDocument/2006/math" xmlns:v="urn:schemas-microsoft-com:vml" xmlns:wp14="http://schemas.microsoft.com/office/word/2010/wordprocessingDrawing" xmlns:wp="http://schemas.openxmlformats.org/drawingml/2006/wordprocessingDrawing" xmlns:w10="urn:schemas-microsoft-com:office:word" xmlns:w="http://schemas.openxmlformats.org/wordprocessingml/2006/main" xmlns:w14="http://schemas.microsoft.com/office/word/2010/wordml" xmlns:w15="http://schemas.microsoft.com/office/word/2012/wordml" xmlns:w16cex="http://schemas.microsoft.com/office/word/2018/wordml/cex" xmlns:w16cid="http://schemas.microsoft.com/office/word/2016/wordml/cid" xmlns:w16="http://schemas.microsoft.com/office/word/2018/wordml" xmlns:w16du="http://schemas.microsoft.com/office/word/2023/wordml/word16du" xmlns:w16sdtdh="http://schemas.microsoft.com/office/word/2020/wordml/sdtdatahash" xmlns:w16sdtfl="http://schemas.microsoft.com/office/word/2024/wordml/sdtformatlock" xmlns:w16se="http://schemas.microsoft.com/office/word/2015/wordml/symex" xmlns:wpg="http://schemas.microsoft.com/office/word/2010/wordprocessingGroup" xmlns:wpi="http://schemas.microsoft.com/office/word/2010/wordprocessingInk" xmlns:wne="http://schemas.microsoft.com/office/word/2006/wordml" xmlns:wps="http://schemas.microsoft.com/office/word/2010/wordprocessingShape" mc:Ignorable="w14 w15 w16se w16cid w16 w16cex w16sdtdh w16sdtfl w16du wp14">
   <w:body>
     <w:p>
       <w:pPr>
@@ -63,23 +63,95 @@
         <w:t xml:space="preserve"> </w:t>
       </w:r>
     </w:p>
+    <w:p>
+      <w:r>
+        <w:t>"MAX Delta DL Spaceship" (</w:t>
+      </w:r>
+      <w:hyperlink r:id="rId6" w:history="1">
+        <w:r>
+          <w:rPr>
+            <w:rStyle w:val="Hyperlink"/>
+          </w:rPr>
+          <w:t>https://skfb.ly/67nKB</w:t>
+        </w:r>
+      </w:hyperlink>
+      <w:r>
+        <w:t>)</w:t>
+      </w:r>
+      <w:r>
+        <w:t xml:space="preserve"> </w:t>
+      </w:r>
+      <w:r>
+        <w:t>by Miru is licensed under Creative Commons Attribution (</w:t>
+      </w:r>
+      <w:hyperlink r:id="rId7" w:history="1">
+        <w:r>
+          <w:rPr>
+            <w:rStyle w:val="Hyperlink"/>
+          </w:rPr>
+          <w:t>http://creativecommons.org/licenses/by/4.0/</w:t>
+        </w:r>
+      </w:hyperlink>
+      <w:r>
+        <w:t>).</w:t>
+      </w:r>
+      <w:r>
+        <w:t xml:space="preserve"> </w:t>
+      </w:r>
+    </w:p>
+    <w:p>
+      <w:r>
+        <w:t>"Space Ship Design" (</w:t>
+      </w:r>
+      <w:hyperlink r:id="rId8" w:history="1">
+        <w:r>
+          <w:rPr>
+            <w:rStyle w:val="Hyperlink"/>
+          </w:rPr>
+          <w:t>https://skfb.ly/GXCt</w:t>
+        </w:r>
+      </w:hyperlink>
+      <w:r>
+        <w:t>) by Johnson Martin is licensed under Creative Commons Attribution (</w:t>
+      </w:r>
+      <w:hyperlink r:id="rId9" w:history="1">
+        <w:r>
+          <w:rPr>
+            <w:rStyle w:val="Hyperlink"/>
+          </w:rPr>
+          <w:t>http://creativecommons.org/licenses/by/4.0/</w:t>
+        </w:r>
+      </w:hyperlink>
+      <w:r>
+        <w:t>).</w:t>
+      </w:r>
+      <w:r>
+        <w:t xml:space="preserve"> </w:t>
+      </w:r>
+    </w:p>
     <w:p/>
     <w:p>
       <w:r>
-        <w:t>"Space Ship Design" (</w:t>
-      </w:r>
-      <w:hyperlink r:id="rId6" w:history="1">
-        <w:r>
-          <w:rPr>
-            <w:rStyle w:val="Hyperlink"/>
-          </w:rPr>
-          <w:t>https://skfb.ly/GXCt</w:t>
-        </w:r>
-      </w:hyperlink>
-      <w:r>
-        <w:t>) by Johnson Martin is licensed under Creative Commons Attribution (</w:t>
-      </w:r>
-      <w:hyperlink r:id="rId7" w:history="1">
+        <w:t>"A-IR Wing - Sun Falcon Skin" (</w:t>
+      </w:r>
+      <w:hyperlink r:id="rId10" w:history="1">
+        <w:r>
+          <w:rPr>
+            <w:rStyle w:val="Hyperlink"/>
+          </w:rPr>
+          <w:t>https://skfb.ly/6zRyC</w:t>
+        </w:r>
+      </w:hyperlink>
+      <w:r>
+        <w:t>)</w:t>
+      </w:r>
+      <w:r>
+        <w:t xml:space="preserve"> </w:t>
+      </w:r>
+      <w:r>
+        <w:t>by Pixel Make is licensed under Creative Commons Attribution (</w:t>
+      </w:r>
+      <w:hyperlink r:id="rId11" w:history="1">
         <w:r>
           <w:rPr>
             <w:rStyle w:val="Hyperlink"/>
@@ -97,14 +169,38 @@
     <w:p/>
     <w:p>
       <w:r>
-        <w:t>"A-IR Wing - Sun Falcon Skin" (</w:t>
-      </w:r>
-      <w:hyperlink r:id="rId8" w:history="1">
-        <w:r>
-          <w:rPr>
-            <w:rStyle w:val="Hyperlink"/>
-          </w:rPr>
-          <w:t>https://skfb.ly/6zRyC</w:t>
+        <w:t xml:space="preserve">Asteroids: </w:t>
+      </w:r>
+    </w:p>
+    <w:p>
+      <w:r>
+        <w:t>"asteroid" (</w:t>
+      </w:r>
+      <w:hyperlink r:id="rId12" w:history="1">
+        <w:r>
+          <w:rPr>
+            <w:rStyle w:val="Hyperlink"/>
+          </w:rPr>
+          <w:t>https://skfb.ly/COwN</w:t>
+        </w:r>
+      </w:hyperlink>
+      <w:r>
+        <w:t xml:space="preserve">) by </w:t>
+      </w:r>
+      <w:proofErr w:type="spellStart"/>
+      <w:r>
+        <w:t>admone</w:t>
+      </w:r>
+      <w:proofErr w:type="spellEnd"/>
+      <w:r>
+        <w:t xml:space="preserve"> is licensed under Creative Commons Attribution (</w:t>
+      </w:r>
+      <w:hyperlink r:id="rId13" w:history="1">
+        <w:r>
+          <w:rPr>
+            <w:rStyle w:val="Hyperlink"/>
+          </w:rPr>
+          <w:t>http://creativecommons.org/licenses/by/4.0/</w:t>
         </w:r>
       </w:hyperlink>
       <w:r>
@@ -113,10 +209,30 @@
       <w:r>
         <w:t xml:space="preserve"> </w:t>
       </w:r>
-      <w:r>
-        <w:t>by Pixel Make is licensed under Creative Commons Attribution (</w:t>
-      </w:r>
-      <w:hyperlink r:id="rId9" w:history="1">
+    </w:p>
+    <w:p/>
+    <w:p>
+      <w:r>
+        <w:t>"Asteroid 01" (</w:t>
+      </w:r>
+      <w:hyperlink r:id="rId14" w:history="1">
+        <w:r>
+          <w:rPr>
+            <w:rStyle w:val="Hyperlink"/>
+          </w:rPr>
+          <w:t>https://skfb.ly/6yJYI</w:t>
+        </w:r>
+      </w:hyperlink>
+      <w:r>
+        <w:t>)</w:t>
+      </w:r>
+      <w:r>
+        <w:t xml:space="preserve"> </w:t>
+      </w:r>
+      <w:r>
+        <w:t xml:space="preserve"> by exabyte is licensed under Creative Commons Attribution (</w:t>
+      </w:r>
+      <w:hyperlink r:id="rId15" w:history="1">
         <w:r>
           <w:rPr>
             <w:rStyle w:val="Hyperlink"/>
@@ -131,41 +247,71 @@
         <w:t xml:space="preserve"> </w:t>
       </w:r>
     </w:p>
-    <w:p>
-      <w:r>
-        <w:t>Tube/Pipe:</w:t>
-      </w:r>
-    </w:p>
     <w:p/>
     <w:p>
       <w:r>
-        <w:t xml:space="preserve">Asteroids: </w:t>
-      </w:r>
-    </w:p>
-    <w:p>
-      <w:r>
-        <w:t>"asteroid" (</w:t>
-      </w:r>
-      <w:hyperlink r:id="rId10" w:history="1">
-        <w:r>
-          <w:rPr>
-            <w:rStyle w:val="Hyperlink"/>
-          </w:rPr>
-          <w:t>https://skfb.ly/COwN</w:t>
-        </w:r>
-      </w:hyperlink>
-      <w:r>
-        <w:t xml:space="preserve">) by </w:t>
+        <w:t>"Metal Asteroid" (</w:t>
+      </w:r>
+      <w:hyperlink r:id="rId16" w:history="1">
+        <w:r>
+          <w:rPr>
+            <w:rStyle w:val="Hyperlink"/>
+          </w:rPr>
+          <w:t>https://skfb.ly/YEuN</w:t>
+        </w:r>
+      </w:hyperlink>
+      <w:r>
+        <w:t>)</w:t>
+      </w:r>
+      <w:r>
+        <w:t xml:space="preserve"> </w:t>
+      </w:r>
+      <w:r>
+        <w:t xml:space="preserve"> by Full Circle CS Inc. is licensed under Creative Commons Attribution (</w:t>
+      </w:r>
+      <w:hyperlink r:id="rId17" w:history="1">
+        <w:r>
+          <w:rPr>
+            <w:rStyle w:val="Hyperlink"/>
+          </w:rPr>
+          <w:t>http://creativecommons.org/licenses/by/4.0/</w:t>
+        </w:r>
+      </w:hyperlink>
+      <w:r>
+        <w:t>).</w:t>
+      </w:r>
+    </w:p>
+    <w:p/>
+    <w:p>
+      <w:r>
+        <w:t>"Asteroids Pack (rocky version)" (</w:t>
+      </w:r>
+      <w:hyperlink r:id="rId18" w:history="1">
+        <w:r>
+          <w:rPr>
+            <w:rStyle w:val="Hyperlink"/>
+          </w:rPr>
+          <w:t>https://skfb.ly/o6LEo</w:t>
+        </w:r>
+      </w:hyperlink>
+      <w:r>
+        <w:t>)</w:t>
+      </w:r>
+      <w:r>
+        <w:t xml:space="preserve"> </w:t>
+      </w:r>
+      <w:r>
+        <w:t xml:space="preserve">by </w:t>
       </w:r>
       <w:proofErr w:type="spellStart"/>
       <w:r>
-        <w:t>admone</w:t>
+        <w:t>SebastianSosnowski</w:t>
       </w:r>
       <w:proofErr w:type="spellEnd"/>
       <w:r>
         <w:t xml:space="preserve"> is licensed under Creative Commons Attribution (</w:t>
       </w:r>
-      <w:hyperlink r:id="rId11" w:history="1">
+      <w:hyperlink r:id="rId19" w:history="1">
         <w:r>
           <w:rPr>
             <w:rStyle w:val="Hyperlink"/>
@@ -174,35 +320,48 @@
         </w:r>
       </w:hyperlink>
       <w:r>
+        <w:t>).</w:t>
+      </w:r>
+      <w:r>
+        <w:t xml:space="preserve"> </w:t>
+      </w:r>
+    </w:p>
+    <w:p/>
+    <w:p>
+      <w:r>
+        <w:t>Star:</w:t>
+      </w:r>
+    </w:p>
+    <w:p>
+      <w:r>
+        <w:t>"Pimp your Platonic solids" (</w:t>
+      </w:r>
+      <w:hyperlink r:id="rId20" w:history="1">
+        <w:r>
+          <w:rPr>
+            <w:rStyle w:val="Hyperlink"/>
+          </w:rPr>
+          <w:t>https://skfb.ly/p6L9D</w:t>
+        </w:r>
+      </w:hyperlink>
+      <w:r>
         <w:t>)</w:t>
       </w:r>
       <w:r>
         <w:t xml:space="preserve"> </w:t>
       </w:r>
-    </w:p>
-    <w:p/>
-    <w:p>
-      <w:r>
-        <w:t>"Asteroid 01" (</w:t>
-      </w:r>
-      <w:hyperlink r:id="rId12" w:history="1">
-        <w:r>
-          <w:rPr>
-            <w:rStyle w:val="Hyperlink"/>
-          </w:rPr>
-          <w:t>https://skfb.ly/6yJYI</w:t>
-        </w:r>
-      </w:hyperlink>
-      <w:r>
-        <w:t>)</w:t>
-      </w:r>
-      <w:r>
-        <w:t xml:space="preserve"> </w:t>
-      </w:r>
-      <w:r>
-        <w:t xml:space="preserve"> by exabyte is licensed under Creative Commons Attribution (</w:t>
-      </w:r>
-      <w:hyperlink r:id="rId13" w:history="1">
+      <w:r>
+        <w:t xml:space="preserve">by </w:t>
+      </w:r>
+      <w:proofErr w:type="spellStart"/>
+      <w:r>
+        <w:t>OuterspaceSoftware</w:t>
+      </w:r>
+      <w:proofErr w:type="spellEnd"/>
+      <w:r>
+        <w:t xml:space="preserve"> is licensed under Creative Commons Attribution (</w:t>
+      </w:r>
+      <w:hyperlink r:id="rId21" w:history="1">
         <w:r>
           <w:rPr>
             <w:rStyle w:val="Hyperlink"/>
@@ -216,137 +375,6 @@
       <w:r>
         <w:t xml:space="preserve"> </w:t>
       </w:r>
-    </w:p>
-    <w:p/>
-    <w:p>
-      <w:r>
-        <w:t>"Metal Asteroid" (</w:t>
-      </w:r>
-      <w:hyperlink r:id="rId14" w:history="1">
-        <w:r>
-          <w:rPr>
-            <w:rStyle w:val="Hyperlink"/>
-          </w:rPr>
-          <w:t>https://skfb.ly/YEuN</w:t>
-        </w:r>
-      </w:hyperlink>
-      <w:r>
-        <w:t>)</w:t>
-      </w:r>
-      <w:r>
-        <w:t xml:space="preserve"> </w:t>
-      </w:r>
-      <w:r>
-        <w:t xml:space="preserve"> by Full Circle CS Inc. is licensed under Creative Commons Attribution (</w:t>
-      </w:r>
-      <w:hyperlink r:id="rId15" w:history="1">
-        <w:r>
-          <w:rPr>
-            <w:rStyle w:val="Hyperlink"/>
-          </w:rPr>
-          <w:t>http://creativecommons.org/licenses/by/4.0/</w:t>
-        </w:r>
-      </w:hyperlink>
-      <w:r>
-        <w:t>).</w:t>
-      </w:r>
-    </w:p>
-    <w:p/>
-    <w:p>
-      <w:r>
-        <w:t>"Asteroids Pack (rocky version)" (</w:t>
-      </w:r>
-      <w:hyperlink r:id="rId16" w:history="1">
-        <w:r>
-          <w:rPr>
-            <w:rStyle w:val="Hyperlink"/>
-          </w:rPr>
-          <w:t>https://skfb.ly/o6LEo</w:t>
-        </w:r>
-      </w:hyperlink>
-      <w:r>
-        <w:t>)</w:t>
-      </w:r>
-      <w:r>
-        <w:t xml:space="preserve"> </w:t>
-      </w:r>
-      <w:r>
-        <w:t xml:space="preserve">by </w:t>
-      </w:r>
-      <w:proofErr w:type="spellStart"/>
-      <w:r>
-        <w:t>SebastianSosnowski</w:t>
-      </w:r>
-      <w:proofErr w:type="spellEnd"/>
-      <w:r>
-        <w:t xml:space="preserve"> is licensed under Creative Commons Attribution (</w:t>
-      </w:r>
-      <w:hyperlink r:id="rId17" w:history="1">
-        <w:r>
-          <w:rPr>
-            <w:rStyle w:val="Hyperlink"/>
-          </w:rPr>
-          <w:t>http://creativecommons.org/licenses/by/4.0/</w:t>
-        </w:r>
-      </w:hyperlink>
-      <w:r>
-        <w:t>).</w:t>
-      </w:r>
-      <w:r>
-        <w:t xml:space="preserve"> </w:t>
-      </w:r>
-    </w:p>
-    <w:p/>
-    <w:p>
-      <w:r>
-        <w:t>Star:</w:t>
-      </w:r>
-    </w:p>
-    <w:p>
-      <w:r>
-        <w:t>"Pimp your Platonic solids" (</w:t>
-      </w:r>
-      <w:hyperlink r:id="rId18" w:history="1">
-        <w:r>
-          <w:rPr>
-            <w:rStyle w:val="Hyperlink"/>
-          </w:rPr>
-          <w:t>https://skfb.ly/p6L9D</w:t>
-        </w:r>
-      </w:hyperlink>
-      <w:r>
-        <w:t>)</w:t>
-      </w:r>
-      <w:r>
-        <w:t xml:space="preserve"> </w:t>
-      </w:r>
-      <w:r>
-        <w:t xml:space="preserve">by </w:t>
-      </w:r>
-      <w:proofErr w:type="spellStart"/>
-      <w:r>
-        <w:t>OuterspaceSoftware</w:t>
-      </w:r>
-      <w:proofErr w:type="spellEnd"/>
-      <w:r>
-        <w:t xml:space="preserve"> is licensed under Creative Commons Attribution (</w:t>
-      </w:r>
-      <w:hyperlink r:id="rId19" w:history="1">
-        <w:r>
-          <w:rPr>
-            <w:rStyle w:val="Hyperlink"/>
-          </w:rPr>
-          <w:t>http://creativecommons.org/licenses/by/4.0/</w:t>
-        </w:r>
-      </w:hyperlink>
-      <w:r>
-        <w:t>).</w:t>
-      </w:r>
-      <w:r>
-        <w:t xml:space="preserve"> </w:t>
-      </w:r>
-      <w:bookmarkStart w:id="0" w:name="_GoBack"/>
-      <w:bookmarkEnd w:id="0"/>
     </w:p>
     <w:sectPr>
       <w:pgSz w:w="12240" w:h="15840"/>
@@ -359,7 +387,7 @@
 </file>
 
 <file path=word/styles.xml><?xml version="1.0" encoding="utf-8"?>
-<w:styles xmlns:mc="http://schemas.openxmlformats.org/markup-compatibility/2006" xmlns:r="http://schemas.openxmlformats.org/officeDocument/2006/relationships" xmlns:w="http://schemas.openxmlformats.org/wordprocessingml/2006/main" xmlns:w14="http://schemas.microsoft.com/office/word/2010/wordml" xmlns:w15="http://schemas.microsoft.com/office/word/2012/wordml" xmlns:w16cid="http://schemas.microsoft.com/office/word/2016/wordml/cid" xmlns:w16se="http://schemas.microsoft.com/office/word/2015/wordml/symex" mc:Ignorable="w14 w15 w16se w16cid">
+<w:styles xmlns:mc="http://schemas.openxmlformats.org/markup-compatibility/2006" xmlns:r="http://schemas.openxmlformats.org/officeDocument/2006/relationships" xmlns:w="http://schemas.openxmlformats.org/wordprocessingml/2006/main" xmlns:w14="http://schemas.microsoft.com/office/word/2010/wordml" xmlns:w15="http://schemas.microsoft.com/office/word/2012/wordml" xmlns:w16cex="http://schemas.microsoft.com/office/word/2018/wordml/cex" xmlns:w16cid="http://schemas.microsoft.com/office/word/2016/wordml/cid" xmlns:w16="http://schemas.microsoft.com/office/word/2018/wordml" xmlns:w16du="http://schemas.microsoft.com/office/word/2023/wordml/word16du" xmlns:w16sdtdh="http://schemas.microsoft.com/office/word/2020/wordml/sdtdatahash" xmlns:w16sdtfl="http://schemas.microsoft.com/office/word/2024/wordml/sdtformatlock" xmlns:w16se="http://schemas.microsoft.com/office/word/2015/wordml/symex" mc:Ignorable="w14 w15 w16se w16cid w16 w16cex w16sdtdh w16sdtfl w16du">
   <w:docDefaults>
     <w:rPrDefault>
       <w:rPr>
@@ -377,7 +405,7 @@
       </w:pPr>
     </w:pPrDefault>
   </w:docDefaults>
-  <w:latentStyles w:defLockedState="0" w:defUIPriority="99" w:defSemiHidden="0" w:defUnhideWhenUsed="0" w:defQFormat="0" w:count="375">
+  <w:latentStyles w:defLockedState="0" w:defUIPriority="99" w:defSemiHidden="0" w:defUnhideWhenUsed="0" w:defQFormat="0" w:count="376">
     <w:lsdException w:name="Normal" w:uiPriority="0" w:qFormat="1"/>
     <w:lsdException w:name="heading 1" w:uiPriority="9" w:qFormat="1"/>
     <w:lsdException w:name="heading 2" w:semiHidden="1" w:uiPriority="9" w:unhideWhenUsed="1" w:qFormat="1"/>
@@ -753,6 +781,7 @@
     <w:lsdException w:name="Smart Hyperlink" w:semiHidden="1" w:unhideWhenUsed="1"/>
     <w:lsdException w:name="Hashtag" w:semiHidden="1" w:unhideWhenUsed="1"/>
     <w:lsdException w:name="Unresolved Mention" w:semiHidden="1" w:unhideWhenUsed="1"/>
+    <w:lsdException w:name="Smart Link" w:semiHidden="1" w:unhideWhenUsed="1"/>
   </w:latentStyles>
   <w:style w:type="paragraph" w:default="1" w:styleId="Normal">
     <w:name w:val="Normal"/>

</xml_diff>